<commit_message>
docs(G3-13): remediate table captions
</commit_message>
<xml_diff>
--- a/docs/deliverables/22-配置管理计划.docx
+++ b/docs/deliverables/22-配置管理计划.docx
@@ -11,7 +11,7 @@
         <w:rPr>
           <w:rFonts w:ascii="Times New Roman" w:hAnsi="Times New Roman" w:eastAsia="宋体"/>
         </w:rPr>
-        <w:t>文档编号：YJGL-G3-13-CMP　　版本号：V0.1</w:t>
+        <w:t>文档编号：YJGL-G3-13-CMP　　版本号：V0.2</w:t>
       </w:r>
     </w:p>
     <w:p>
@@ -417,6 +417,113 @@
           </w:p>
         </w:tc>
       </w:tr>
+      <w:tr>
+        <w:tc>
+          <w:tcPr>
+            <w:tcW w:type="dxa" w:w="1088"/>
+            <w:vAlign w:val="center"/>
+          </w:tcPr>
+          <w:p>
+            <w:pPr>
+              <w:spacing w:after="0" w:line="240" w:lineRule="auto"/>
+              <w:jc w:val="left"/>
+            </w:pPr>
+            <w:r/>
+            <w:r>
+              <w:rPr>
+                <w:rFonts w:ascii="Times New Roman" w:hAnsi="Times New Roman" w:eastAsia="宋体"/>
+                <w:b w:val="0"/>
+                <w:sz w:val="15"/>
+              </w:rPr>
+              <w:t>V0.2</w:t>
+            </w:r>
+          </w:p>
+        </w:tc>
+        <w:tc>
+          <w:tcPr>
+            <w:tcW w:type="dxa" w:w="1360"/>
+            <w:vAlign w:val="center"/>
+          </w:tcPr>
+          <w:p>
+            <w:pPr>
+              <w:spacing w:after="0" w:line="240" w:lineRule="auto"/>
+              <w:jc w:val="left"/>
+            </w:pPr>
+            <w:r/>
+            <w:r>
+              <w:rPr>
+                <w:rFonts w:ascii="Times New Roman" w:hAnsi="Times New Roman" w:eastAsia="宋体"/>
+                <w:b w:val="0"/>
+                <w:sz w:val="15"/>
+              </w:rPr>
+              <w:t>2026-09-20</w:t>
+            </w:r>
+          </w:p>
+        </w:tc>
+        <w:tc>
+          <w:tcPr>
+            <w:tcW w:type="dxa" w:w="3265"/>
+            <w:vAlign w:val="center"/>
+          </w:tcPr>
+          <w:p>
+            <w:pPr>
+              <w:spacing w:after="0" w:line="240" w:lineRule="auto"/>
+              <w:jc w:val="left"/>
+            </w:pPr>
+            <w:r/>
+            <w:r>
+              <w:rPr>
+                <w:rFonts w:ascii="Times New Roman" w:hAnsi="Times New Roman" w:eastAsia="宋体"/>
+                <w:b w:val="0"/>
+                <w:sz w:val="15"/>
+              </w:rPr>
+              <w:t>表 1-1—表 10-1</w:t>
+            </w:r>
+          </w:p>
+        </w:tc>
+        <w:tc>
+          <w:tcPr>
+            <w:tcW w:type="dxa" w:w="1360"/>
+            <w:vAlign w:val="center"/>
+          </w:tcPr>
+          <w:p>
+            <w:pPr>
+              <w:spacing w:after="0" w:line="240" w:lineRule="auto"/>
+              <w:jc w:val="left"/>
+            </w:pPr>
+            <w:r/>
+            <w:r>
+              <w:rPr>
+                <w:rFonts w:ascii="Times New Roman" w:hAnsi="Times New Roman" w:eastAsia="宋体"/>
+                <w:b w:val="0"/>
+                <w:sz w:val="15"/>
+              </w:rPr>
+              <w:t>按 ISSUE-G3-13-001 为 9 张业务表补齐连续、紧邻的独立表题；业务规则、数字、责任、Issue 状态和抽查结论不变。</w:t>
+            </w:r>
+          </w:p>
+        </w:tc>
+        <w:tc>
+          <w:tcPr>
+            <w:tcW w:type="dxa" w:w="1995"/>
+            <w:vAlign w:val="center"/>
+          </w:tcPr>
+          <w:p>
+            <w:pPr>
+              <w:spacing w:after="0" w:line="240" w:lineRule="auto"/>
+              <w:jc w:val="left"/>
+            </w:pPr>
+            <w:r/>
+            <w:r>
+              <w:rPr>
+                <w:rFonts w:ascii="Times New Roman" w:hAnsi="Times New Roman" w:eastAsia="宋体"/>
+                <w:b w:val="0"/>
+                <w:sz w:val="15"/>
+              </w:rPr>
+              <w:t>何思源</w:t>
+            </w:r>
+          </w:p>
+        </w:tc>
+      </w:tr>
     </w:tbl>
     <w:p>
       <w:pPr>
@@ -1055,6 +1162,21 @@
           <w:b/>
         </w:rPr>
         <w:t>1.3 依据与优先级</w:t>
+      </w:r>
+    </w:p>
+    <w:p>
+      <w:pPr>
+        <w:keepNext/>
+        <w:spacing w:before="80" w:after="60"/>
+        <w:jc w:val="center"/>
+      </w:pPr>
+      <w:r>
+        <w:rPr>
+          <w:rFonts w:ascii="Times New Roman" w:hAnsi="Times New Roman" w:eastAsia="黑体"/>
+          <w:b/>
+          <w:sz w:val="18"/>
+        </w:rPr>
+        <w:t>表 1-1 配置管理依据及用途</w:t>
       </w:r>
     </w:p>
     <w:tbl>
@@ -1360,6 +1482,21 @@
           <w:b/>
         </w:rPr>
         <w:t>2 组织、职责与职责分离</w:t>
+      </w:r>
+    </w:p>
+    <w:p>
+      <w:pPr>
+        <w:keepNext/>
+        <w:spacing w:before="80" w:after="60"/>
+        <w:jc w:val="center"/>
+      </w:pPr>
+      <w:r>
+        <w:rPr>
+          <w:rFonts w:ascii="Times New Roman" w:hAnsi="Times New Roman" w:eastAsia="黑体"/>
+          <w:b/>
+          <w:sz w:val="18"/>
+        </w:rPr>
+        <w:t>表 2-1 配置管理角色职责与权限边界</w:t>
       </w:r>
     </w:p>
     <w:tbl>
@@ -1805,6 +1942,21 @@
           <w:b/>
         </w:rPr>
         <w:t>3.1 配置项类别与清单</w:t>
+      </w:r>
+    </w:p>
+    <w:p>
+      <w:pPr>
+        <w:keepNext/>
+        <w:spacing w:before="80" w:after="60"/>
+        <w:jc w:val="center"/>
+      </w:pPr>
+      <w:r>
+        <w:rPr>
+          <w:rFonts w:ascii="Times New Roman" w:hAnsi="Times New Roman" w:eastAsia="黑体"/>
+          <w:b/>
+          <w:sz w:val="18"/>
+        </w:rPr>
+        <w:t>表 3-1 配置项类别与最低完整性检查</w:t>
       </w:r>
     </w:p>
     <w:tbl>
@@ -3068,6 +3220,21 @@
         <w:t>4.1 版本标识</w:t>
       </w:r>
     </w:p>
+    <w:p>
+      <w:pPr>
+        <w:keepNext/>
+        <w:spacing w:before="80" w:after="60"/>
+        <w:jc w:val="center"/>
+      </w:pPr>
+      <w:r>
+        <w:rPr>
+          <w:rFonts w:ascii="Times New Roman" w:hAnsi="Times New Roman" w:eastAsia="黑体"/>
+          <w:b/>
+          <w:sz w:val="18"/>
+        </w:rPr>
+        <w:t>表 4-1 配置对象版本标识规则</w:t>
+      </w:r>
+    </w:p>
     <w:tbl>
       <w:tblPr>
         <w:tblW w:type="auto" w:w="0"/>
@@ -3616,6 +3783,21 @@
           <w:b/>
         </w:rPr>
         <w:t>5.1 基线类型与内容</w:t>
+      </w:r>
+    </w:p>
+    <w:p>
+      <w:pPr>
+        <w:keepNext/>
+        <w:spacing w:before="80" w:after="60"/>
+        <w:jc w:val="center"/>
+      </w:pPr>
+      <w:r>
+        <w:rPr>
+          <w:rFonts w:ascii="Times New Roman" w:hAnsi="Times New Roman" w:eastAsia="黑体"/>
+          <w:b/>
+          <w:sz w:val="18"/>
+        </w:rPr>
+        <w:t>表 5-1 基线类型、建立门禁与变更权限</w:t>
       </w:r>
     </w:p>
     <w:tbl>
@@ -4295,6 +4477,21 @@
         <w:t>6.2 流程与裁决</w:t>
       </w:r>
     </w:p>
+    <w:p>
+      <w:pPr>
+        <w:keepNext/>
+        <w:spacing w:before="80" w:after="60"/>
+        <w:jc w:val="center"/>
+      </w:pPr>
+      <w:r>
+        <w:rPr>
+          <w:rFonts w:ascii="Times New Roman" w:hAnsi="Times New Roman" w:eastAsia="黑体"/>
+          <w:b/>
+          <w:sz w:val="18"/>
+        </w:rPr>
+        <w:t>表 6-1 CR 与 CCB 处理流程</w:t>
+      </w:r>
+    </w:p>
     <w:tbl>
       <w:tblPr>
         <w:tblW w:type="auto" w:w="0"/>
@@ -4895,6 +5092,21 @@
           <w:b/>
         </w:rPr>
         <w:t>7.2 审计类型</w:t>
+      </w:r>
+    </w:p>
+    <w:p>
+      <w:pPr>
+        <w:keepNext/>
+        <w:spacing w:before="80" w:after="60"/>
+        <w:jc w:val="center"/>
+      </w:pPr>
+      <w:r>
+        <w:rPr>
+          <w:rFonts w:ascii="Times New Roman" w:hAnsi="Times New Roman" w:eastAsia="黑体"/>
+          <w:b/>
+          <w:sz w:val="18"/>
+        </w:rPr>
+        <w:t>表 7-1 配置审计类型、时点与证据</w:t>
       </w:r>
     </w:p>
     <w:tbl>
@@ -5515,6 +5727,21 @@
         <w:t>9.1 逻辑结构</w:t>
       </w:r>
     </w:p>
+    <w:p>
+      <w:pPr>
+        <w:keepNext/>
+        <w:spacing w:before="80" w:after="60"/>
+        <w:jc w:val="center"/>
+      </w:pPr>
+      <w:r>
+        <w:rPr>
+          <w:rFonts w:ascii="Times New Roman" w:hAnsi="Times New Roman" w:eastAsia="黑体"/>
+          <w:b/>
+          <w:sz w:val="18"/>
+        </w:rPr>
+        <w:t>表 9-1 配置库逻辑区域与控制要求</w:t>
+      </w:r>
+    </w:p>
     <w:tbl>
       <w:tblPr>
         <w:tblW w:type="auto" w:w="0"/>
@@ -6037,6 +6264,21 @@
           <w:sz w:val="21"/>
         </w:rPr>
         <w:t>AC-G2-FR-013-01 的受控语义是：授权用户在 Web 或 H5 端提交事件基本信息时，系统创建事件并生成可追踪编号。本计划不把该 AC 改写成配置管理需求，而是规定支撑其实现和验证的配置链必须完整。</w:t>
+      </w:r>
+    </w:p>
+    <w:p>
+      <w:pPr>
+        <w:keepNext/>
+        <w:spacing w:before="80" w:after="60"/>
+        <w:jc w:val="center"/>
+      </w:pPr>
+      <w:r>
+        <w:rPr>
+          <w:rFonts w:ascii="Times New Roman" w:hAnsi="Times New Roman" w:eastAsia="黑体"/>
+          <w:b/>
+          <w:sz w:val="18"/>
+        </w:rPr>
+        <w:t>表 10-1 AC-G2-FR-013-01 配置证据抽查</w:t>
       </w:r>
     </w:p>
     <w:tbl>

</xml_diff>